<commit_message>
Atualizado readme.md com link YT e GitHub
</commit_message>
<xml_diff>
--- a/Explicativo Mobile Development.docx
+++ b/Explicativo Mobile Development.docx
@@ -276,9 +276,9 @@
           <w:noProof/>
         </w:rPr>
         <w:drawing>
-          <wp:inline distT="0" distB="0" distL="0" distR="0" wp14:anchorId="69DE13AB" wp14:editId="6A828BA1">
-            <wp:extent cx="5486400" cy="2754630"/>
-            <wp:effectExtent l="0" t="0" r="0" b="7620"/>
+          <wp:inline distT="0" distB="0" distL="0" distR="0" wp14:anchorId="69DE13AB" wp14:editId="5A4495EF">
+            <wp:extent cx="3395801" cy="1704975"/>
+            <wp:effectExtent l="0" t="0" r="0" b="0"/>
             <wp:docPr id="1" name="Imagem 1"/>
             <wp:cNvGraphicFramePr>
               <a:graphicFrameLocks xmlns:a="http://schemas.openxmlformats.org/drawingml/2006/main" noChangeAspect="1"/>
@@ -299,7 +299,7 @@
                   <pic:spPr>
                     <a:xfrm>
                       <a:off x="0" y="0"/>
-                      <a:ext cx="5486400" cy="2754630"/>
+                      <a:ext cx="3409669" cy="1711938"/>
                     </a:xfrm>
                     <a:prstGeom prst="rect">
                       <a:avLst/>
@@ -350,10 +350,9 @@
         <w:rPr>
           <w:noProof/>
         </w:rPr>
-        <w:lastRenderedPageBreak/>
         <w:drawing>
-          <wp:inline distT="0" distB="0" distL="0" distR="0" wp14:anchorId="3C86F18A" wp14:editId="012FBF94">
-            <wp:extent cx="5486400" cy="2771140"/>
+          <wp:inline distT="0" distB="0" distL="0" distR="0" wp14:anchorId="3C86F18A" wp14:editId="7C2E2FE1">
+            <wp:extent cx="3371850" cy="1703096"/>
             <wp:effectExtent l="0" t="0" r="0" b="0"/>
             <wp:docPr id="2" name="Imagem 2"/>
             <wp:cNvGraphicFramePr>
@@ -375,7 +374,7 @@
                   <pic:spPr>
                     <a:xfrm>
                       <a:off x="0" y="0"/>
-                      <a:ext cx="5486400" cy="2771140"/>
+                      <a:ext cx="3378966" cy="1706690"/>
                     </a:xfrm>
                     <a:prstGeom prst="rect">
                       <a:avLst/>
@@ -430,6 +429,7 @@
         <w:br/>
       </w:r>
       <w:r>
+        <w:lastRenderedPageBreak/>
         <w:br/>
       </w:r>
       <w:r>
@@ -437,9 +437,9 @@
           <w:noProof/>
         </w:rPr>
         <w:drawing>
-          <wp:inline distT="0" distB="0" distL="0" distR="0" wp14:anchorId="3B4D1D64" wp14:editId="33F997E7">
-            <wp:extent cx="5486400" cy="2762250"/>
-            <wp:effectExtent l="0" t="0" r="0" b="0"/>
+          <wp:inline distT="0" distB="0" distL="0" distR="0" wp14:anchorId="3B4D1D64" wp14:editId="633C4DBA">
+            <wp:extent cx="3178329" cy="1600200"/>
+            <wp:effectExtent l="0" t="0" r="3175" b="0"/>
             <wp:docPr id="3" name="Imagem 3"/>
             <wp:cNvGraphicFramePr>
               <a:graphicFrameLocks xmlns:a="http://schemas.openxmlformats.org/drawingml/2006/main" noChangeAspect="1"/>
@@ -460,7 +460,7 @@
                   <pic:spPr>
                     <a:xfrm>
                       <a:off x="0" y="0"/>
-                      <a:ext cx="5486400" cy="2762250"/>
+                      <a:ext cx="3191297" cy="1606729"/>
                     </a:xfrm>
                     <a:prstGeom prst="rect">
                       <a:avLst/>
@@ -482,88 +482,76 @@
       <w:r>
         <w:rPr>
           <w:rStyle w:val="Ttulo1Char"/>
+          <w:lang w:val="pt-BR"/>
         </w:rPr>
         <w:br/>
       </w:r>
       <w:r>
         <w:rPr>
           <w:rStyle w:val="Ttulo1Char"/>
+          <w:lang w:val="pt-BR"/>
         </w:rPr>
         <w:br/>
       </w:r>
       <w:r>
         <w:rPr>
           <w:rStyle w:val="Ttulo1Char"/>
+          <w:lang w:val="pt-BR"/>
         </w:rPr>
         <w:br/>
       </w:r>
       <w:r>
         <w:rPr>
           <w:rStyle w:val="Ttulo1Char"/>
+          <w:lang w:val="pt-BR"/>
         </w:rPr>
-        <w:lastRenderedPageBreak/>
         <w:t>4</w:t>
       </w:r>
       <w:r>
         <w:rPr>
           <w:rStyle w:val="Ttulo1Char"/>
+          <w:lang w:val="pt-BR"/>
         </w:rPr>
         <w:t xml:space="preserve">. </w:t>
       </w:r>
       <w:r>
         <w:rPr>
           <w:rStyle w:val="Ttulo1Char"/>
+          <w:lang w:val="pt-BR"/>
         </w:rPr>
         <w:t>Tela do Carrinho</w:t>
       </w:r>
       <w:r>
         <w:rPr>
           <w:rStyle w:val="Ttulo1Char"/>
+          <w:lang w:val="pt-BR"/>
         </w:rPr>
         <w:br/>
       </w:r>
       <w:r>
         <w:rPr>
           <w:rStyle w:val="Ttulo1Char"/>
+          <w:lang w:val="pt-BR"/>
         </w:rPr>
         <w:br/>
       </w:r>
       <w:r>
-        <w:t xml:space="preserve">A tela do carrinho mostra todos os produtos que o usuário adicionou durante a navegação no aplicativo. Nela é possível visualizar os itens selecionados, juntamente com seus preços, e conferir o valor total da compra. O gerenciamento desses dados é feito por meio do estado global da aplicação, garantindo que os produtos adicionados sejam mantidos enquanto o </w:t>
-      </w:r>
-      <w:proofErr w:type="spellStart"/>
-      <w:r>
-        <w:t>usuário</w:t>
-      </w:r>
-      <w:proofErr w:type="spellEnd"/>
-      <w:r>
-        <w:t xml:space="preserve"> </w:t>
-      </w:r>
-      <w:proofErr w:type="spellStart"/>
-      <w:r>
-        <w:t>utiliza</w:t>
-      </w:r>
-      <w:proofErr w:type="spellEnd"/>
-      <w:r>
-        <w:t xml:space="preserve"> o </w:t>
-      </w:r>
-      <w:proofErr w:type="spellStart"/>
-      <w:r>
-        <w:t>aplicativo</w:t>
-      </w:r>
-      <w:proofErr w:type="spellEnd"/>
-      <w:r>
-        <w:t>.</w:t>
+        <w:rPr>
+          <w:lang w:val="pt-BR"/>
+        </w:rPr>
+        <w:t>A tela do carrinho mostra todos os produtos que o usuário adicionou durante a navegação no aplicativo. Nela é possível visualizar os itens selecionados, juntamente com seus preços, e conferir o valor total da compra. O gerenciamento desses dados é feito por meio do estado global da aplicação, garantindo que os produtos adicionados sejam mantidos enquanto o usuário utiliza o aplicativo.</w:t>
       </w:r>
       <w:r>
         <w:rPr>
           <w:rStyle w:val="Ttulo1Char"/>
+          <w:lang w:val="pt-BR"/>
         </w:rPr>
         <w:br/>
       </w:r>
       <w:r>
         <w:rPr>
           <w:rStyle w:val="Ttulo1Char"/>
+          <w:lang w:val="pt-BR"/>
         </w:rPr>
         <w:br/>
       </w:r>
@@ -572,9 +560,9 @@
           <w:noProof/>
         </w:rPr>
         <w:drawing>
-          <wp:inline distT="0" distB="0" distL="0" distR="0" wp14:anchorId="258B6B80" wp14:editId="2FC27C65">
-            <wp:extent cx="5486400" cy="2743200"/>
-            <wp:effectExtent l="0" t="0" r="0" b="0"/>
+          <wp:inline distT="0" distB="0" distL="0" distR="0" wp14:anchorId="258B6B80" wp14:editId="53E13D84">
+            <wp:extent cx="2800350" cy="1400175"/>
+            <wp:effectExtent l="0" t="0" r="0" b="9525"/>
             <wp:docPr id="4" name="Imagem 4"/>
             <wp:cNvGraphicFramePr>
               <a:graphicFrameLocks xmlns:a="http://schemas.openxmlformats.org/drawingml/2006/main" noChangeAspect="1"/>
@@ -595,7 +583,7 @@
                   <pic:spPr>
                     <a:xfrm>
                       <a:off x="0" y="0"/>
-                      <a:ext cx="5486400" cy="2743200"/>
+                      <a:ext cx="2800710" cy="1400355"/>
                     </a:xfrm>
                     <a:prstGeom prst="rect">
                       <a:avLst/>
@@ -610,6 +598,7 @@
       <w:r>
         <w:rPr>
           <w:rStyle w:val="Ttulo1Char"/>
+          <w:lang w:val="pt-BR"/>
         </w:rPr>
         <w:br/>
       </w:r>

</xml_diff>